<commit_message>
docs: record published M1 version and final task snapshot
</commit_message>
<xml_diff>
--- a/process/reviews/m1-member-review.docx
+++ b/process/reviews/m1-member-review.docx
@@ -776,7 +776,23 @@
       </w:pPr>
       <w:r>
         <w:rPr/>
-        <w:t>复核对象为本地仓库当前修订版，报告校验值见版本记录。后续提交并推送仓库，固定交付版本后重新打包；正式提交仍按课程接收口径执行。</w:t>
+        <w:t>复核对象为本地仓库当前修订版，报告校验值见版本记录。材料已提交并推送至</w:t>
+      </w:r>
+      <w:r>
+        <w:rPr/>
+        <w:t>main</w:t>
+      </w:r>
+      <w:r>
+        <w:rPr/>
+        <w:t>，报告及过程材料正文版本为</w:t>
+      </w:r>
+      <w:r>
+        <w:rPr/>
+        <w:t>1373c10</w:t>
+      </w:r>
+      <w:r>
+        <w:rPr/>
+        <w:t>；过程包按更新后的版本记录打包，正式提交仍按课程接收口径执行。</w:t>
       </w:r>
     </w:p>
     <w:sectPr>

</xml_diff>